<commit_message>
Deploy preview for PR 6 🛫
</commit_message>
<xml_diff>
--- a/pr-preview/pr-6/vignettes/articles/using-ettbc.docx
+++ b/pr-preview/pr-6/vignettes/articles/using-ettbc.docx
@@ -4586,7 +4586,19 @@
               <w:t xml:space="preserve"> </w:t>
             </w:r>
             <w:r>
-              <w:t xml:space="preserve">mechanisms in each arm. See García-Albéniz et al. (2020) for the full</w:t>
+              <w:t xml:space="preserve">mechanisms in each arm. See</w:t>
+            </w:r>
+            <w:r>
+              <w:t xml:space="preserve"> </w:t>
+            </w:r>
+            <w:r>
+              <w:t xml:space="preserve">García-Albéniz et al. (2020)</w:t>
+            </w:r>
+            <w:r>
+              <w:t xml:space="preserve"> </w:t>
+            </w:r>
+            <w:r>
+              <w:t xml:space="preserve">for the full</w:t>
             </w:r>
             <w:r>
               <w:t xml:space="preserve"> </w:t>

</xml_diff>